<commit_message>
Support Partner wording inside Proprietor Affidavit
</commit_message>
<xml_diff>
--- a/templates/AFFIDAVIT (prop).docx
+++ b/templates/AFFIDAVIT (prop).docx
@@ -12,7 +12,7 @@
           <w:b/>
           <w:sz w:val="22"/>
         </w:rPr>
-        <w:t>AFFIDAVIT (Prop)</w:t>
+        <w:t>AFFIDAVIT ({% if entity_val == 'Partner' %}Partner{% else %}Prop{% endif %})</w:t>
       </w:r>
     </w:p>
     <w:p/>
@@ -41,7 +41,7 @@
           <w:rFonts w:ascii="Calibri" w:hAnsi="Calibri"/>
           <w:sz w:val="22"/>
         </w:rPr>
-        <w:t>2. That I am sole proprietor of the firm M/s {{r firm_name }} Situated at {{r firm_address }}, and do hereby applying for grant of new retail sale Drug License.</w:t>
+        <w:t>2. That I am {% if entity_val == 'Partner' %}partner{% else %}sole proprietor{% endif %} of the firm M/s {{r firm_name }} Situated at {{r firm_address }}, and do hereby applying for grant of new retail sale Drug License.</w:t>
       </w:r>
     </w:p>
     <w:p>

</xml_diff>